<commit_message>
Residual-demand floor for Commander-banned chase cards
Banned cards (Mana Crypt, the Power 9, Jeweled Lotus, Dockside) now keep a discounted
floor from price level and breadth, so their surviving eternal-format and collector
demand lands them at the top of the Moderate band rather than in the basement. Updated
report, predictions, social, and track record. Composite weights and floor coefficients
remain private.

Co-Authored-By: Claude Opus 4.8 (1M context) <noreply@anthropic.com>
</commit_message>
<xml_diff>
--- a/TechnicalPaper/mtg-demand-signal_technical-report.docx
+++ b/TechnicalPaper/mtg-demand-signal_technical-report.docx
@@ -539,7 +539,7 @@
       <w:r>
         <w:drawing>
           <wp:inline>
-            <wp:extent cx="5334000" cy="2960748"/>
+            <wp:extent cx="5334000" cy="2957522"/>
             <wp:effectExtent b="0" l="0" r="0" t="0"/>
             <wp:docPr descr="Distribution" title="" id="22" name="Picture"/>
             <a:graphic>
@@ -560,7 +560,7 @@
                   <pic:spPr bwMode="auto">
                     <a:xfrm>
                       <a:off x="0" y="0"/>
-                      <a:ext cx="5334000" cy="2960748"/>
+                      <a:ext cx="5334000" cy="2957522"/>
                     </a:xfrm>
                     <a:prstGeom prst="rect">
                       <a:avLst/>
@@ -667,19 +667,25 @@
         <w:t xml:space="preserve"> </w:t>
       </w:r>
       <w:r>
-        <w:t xml:space="preserve">The price LEVEL is deliberately not an input to the</w:t>
-      </w:r>
-      <w:r>
-        <w:t xml:space="preserve"> </w:t>
-      </w:r>
-      <w:r>
-        <w:t xml:space="preserve">score (only price appreciation is). Yet when cards are binned by demand decile, the median market</w:t>
-      </w:r>
-      <w:r>
-        <w:t xml:space="preserve"> </w:t>
-      </w:r>
-      <w:r>
-        <w:t xml:space="preserve">price climbs steadily with demand (Spearman correlation</w:t>
+        <w:t xml:space="preserve">The price LEVEL is not a general input to the score</w:t>
+      </w:r>
+      <w:r>
+        <w:t xml:space="preserve"> </w:t>
+      </w:r>
+      <w:r>
+        <w:t xml:space="preserve">(only price appreciation is, plus a residual floor for the small set of Commander-banned cards</w:t>
+      </w:r>
+      <w:r>
+        <w:t xml:space="preserve"> </w:t>
+      </w:r>
+      <w:r>
+        <w:t xml:space="preserve">described below). Yet when cards are binned by demand decile, the median market price climbs steadily</w:t>
+      </w:r>
+      <w:r>
+        <w:t xml:space="preserve"> </w:t>
+      </w:r>
+      <w:r>
+        <w:t xml:space="preserve">with demand (Spearman correlation</w:t>
       </w:r>
       <w:r>
         <w:t xml:space="preserve"> </w:t>
@@ -689,16 +695,16 @@
           <w:bCs/>
           <w:b/>
         </w:rPr>
-        <w:t xml:space="preserve">0.294</w:t>
-      </w:r>
-      <w:r>
-        <w:t xml:space="preserve">). The index lines</w:t>
-      </w:r>
-      <w:r>
-        <w:t xml:space="preserve"> </w:t>
-      </w:r>
-      <w:r>
-        <w:t xml:space="preserve">up with what the market actually pays.</w:t>
+        <w:t xml:space="preserve">0.297</w:t>
+      </w:r>
+      <w:r>
+        <w:t xml:space="preserve">). The index lines up with what the market</w:t>
+      </w:r>
+      <w:r>
+        <w:t xml:space="preserve"> </w:t>
+      </w:r>
+      <w:r>
+        <w:t xml:space="preserve">actually pays.</w:t>
       </w:r>
     </w:p>
     <w:p>
@@ -1684,7 +1690,7 @@
               <w:jc w:val="left"/>
             </w:pPr>
             <w:r>
-              <w:t xml:space="preserve">17,125</w:t>
+              <w:t xml:space="preserve">17,151</w:t>
             </w:r>
           </w:p>
         </w:tc>
@@ -1746,7 +1752,7 @@
               <w:jc w:val="left"/>
             </w:pPr>
             <w:r>
-              <w:t xml:space="preserve">12,635</w:t>
+              <w:t xml:space="preserve">12,614</w:t>
             </w:r>
           </w:p>
         </w:tc>
@@ -1808,19 +1814,19 @@
               <w:jc w:val="left"/>
             </w:pPr>
             <w:r>
-              <w:t xml:space="preserve">16</w:t>
-            </w:r>
-          </w:p>
-        </w:tc>
-        <w:tc>
-          <w:tcPr/>
-          <w:p>
-            <w:pPr>
-              <w:pStyle w:val="Compact"/>
-              <w:jc w:val="left"/>
-            </w:pPr>
-            <w:r>
-              <w:t xml:space="preserve">$2.71</w:t>
+              <w:t xml:space="preserve">11</w:t>
+            </w:r>
+          </w:p>
+        </w:tc>
+        <w:tc>
+          <w:tcPr/>
+          <w:p>
+            <w:pPr>
+              <w:pStyle w:val="Compact"/>
+              <w:jc w:val="left"/>
+            </w:pPr>
+            <w:r>
+              <w:t xml:space="preserve">$2.79</w:t>
             </w:r>
           </w:p>
         </w:tc>
@@ -2047,25 +2053,55 @@
           <w:bCs/>
           <w:b/>
         </w:rPr>
-        <w:t xml:space="preserve">Bans show up as lost demand, once.</w:t>
-      </w:r>
-      <w:r>
-        <w:t xml:space="preserve"> </w:t>
-      </w:r>
-      <w:r>
-        <w:t xml:space="preserve">A Commander ban removes a card from EDHREC inclusion, so a</w:t>
-      </w:r>
-      <w:r>
-        <w:t xml:space="preserve"> </w:t>
-      </w:r>
-      <w:r>
-        <w:t xml:space="preserve">banned card loses its largest component and falls into the lower buckets. Cards banned only in</w:t>
-      </w:r>
-      <w:r>
-        <w:t xml:space="preserve"> </w:t>
-      </w:r>
-      <w:r>
-        <w:t xml:space="preserve">competitive formats (often for being too strong) carry no penalty, because that is not low demand.</w:t>
+        <w:t xml:space="preserve">Bans reduce demand, but do not erase it.</w:t>
+      </w:r>
+      <w:r>
+        <w:t xml:space="preserve"> </w:t>
+      </w:r>
+      <w:r>
+        <w:t xml:space="preserve">A Commander ban removes a card from EDHREC inclusion,</w:t>
+      </w:r>
+      <w:r>
+        <w:t xml:space="preserve"> </w:t>
+      </w:r>
+      <w:r>
+        <w:t xml:space="preserve">so a banned card loses its largest demand component. Much of that demand survives in the eternal</w:t>
+      </w:r>
+      <w:r>
+        <w:t xml:space="preserve"> </w:t>
+      </w:r>
+      <w:r>
+        <w:t xml:space="preserve">formats and the collector market, though, which is revealed by the price the card still commands and</w:t>
+      </w:r>
+      <w:r>
+        <w:t xml:space="preserve"> </w:t>
+      </w:r>
+      <w:r>
+        <w:t xml:space="preserve">how widely it was printed. So Commander-banned cards keep a discounted residual-demand floor built</w:t>
+      </w:r>
+      <w:r>
+        <w:t xml:space="preserve"> </w:t>
+      </w:r>
+      <w:r>
+        <w:t xml:space="preserve">from price level and breadth, which lands still-coveted cards like Mana Crypt and the Power 9 at the</w:t>
+      </w:r>
+      <w:r>
+        <w:t xml:space="preserve"> </w:t>
+      </w:r>
+      <w:r>
+        <w:t xml:space="preserve">top of the Moderate band instead of in the basement, while genuinely dead banned cards (low price)</w:t>
+      </w:r>
+      <w:r>
+        <w:t xml:space="preserve"> </w:t>
+      </w:r>
+      <w:r>
+        <w:t xml:space="preserve">stay low. Cards banned only in competitive formats (often for being too strong) carry no penalty.</w:t>
+      </w:r>
+      <w:r>
+        <w:t xml:space="preserve"> </w:t>
+      </w:r>
+      <w:r>
+        <w:t xml:space="preserve">WotC-removed offensive cards are excluded from the floor so it never elevates them.</w:t>
       </w:r>
     </w:p>
     <w:p>

</xml_diff>